<commit_message>
DOCS : Modifs Exercices Fonctions
</commit_message>
<xml_diff>
--- a/Fonctions/Exercices Fonctions.docx
+++ b/Fonctions/Exercices Fonctions.docx
@@ -99,23 +99,6 @@
       <w:pPr>
         <w:pStyle w:val="Paragraphedeliste"/>
         <w:numPr>
-          <w:ilvl w:val="1"/>
-          <w:numId w:val="1"/>
-        </w:numPr>
-      </w:pPr>
-      <w:r>
-        <w:t xml:space="preserve">AFFICHER </w:t>
-      </w:r>
-      <w:proofErr w:type="spellStart"/>
-      <w:r>
-        <w:t>MontantTVA</w:t>
-      </w:r>
-      <w:proofErr w:type="spellEnd"/>
-    </w:p>
-    <w:p>
-      <w:pPr>
-        <w:pStyle w:val="Paragraphedeliste"/>
-        <w:numPr>
           <w:ilvl w:val="0"/>
           <w:numId w:val="1"/>
         </w:numPr>
@@ -127,6 +110,122 @@
     <w:p/>
     <w:p>
       <w:r>
+        <w:t>Utilisation</w:t>
+      </w:r>
+    </w:p>
+    <w:p>
+      <w:pPr>
+        <w:pStyle w:val="Paragraphedeliste"/>
+        <w:numPr>
+          <w:ilvl w:val="0"/>
+          <w:numId w:val="5"/>
+        </w:numPr>
+      </w:pPr>
+      <w:proofErr w:type="spellStart"/>
+      <w:r>
+        <w:t>PrixHT</w:t>
+      </w:r>
+      <w:proofErr w:type="spellEnd"/>
+      <w:r>
+        <w:t xml:space="preserve"> &lt;- </w:t>
+      </w:r>
+      <w:proofErr w:type="spellStart"/>
+      <w:r>
+        <w:t>PrixHT</w:t>
+      </w:r>
+      <w:proofErr w:type="spellEnd"/>
+      <w:r>
+        <w:t xml:space="preserve"> entré</w:t>
+      </w:r>
+    </w:p>
+    <w:p>
+      <w:pPr>
+        <w:pStyle w:val="Paragraphedeliste"/>
+        <w:numPr>
+          <w:ilvl w:val="0"/>
+          <w:numId w:val="5"/>
+        </w:numPr>
+      </w:pPr>
+      <w:proofErr w:type="spellStart"/>
+      <w:r>
+        <w:t>TauxTVA</w:t>
+      </w:r>
+      <w:proofErr w:type="spellEnd"/>
+      <w:r>
+        <w:t xml:space="preserve"> &lt;- </w:t>
+      </w:r>
+      <w:proofErr w:type="spellStart"/>
+      <w:r>
+        <w:t>TauxTVA</w:t>
+      </w:r>
+      <w:proofErr w:type="spellEnd"/>
+      <w:r>
+        <w:t xml:space="preserve"> entré</w:t>
+      </w:r>
+    </w:p>
+    <w:p>
+      <w:pPr>
+        <w:pStyle w:val="Paragraphedeliste"/>
+        <w:numPr>
+          <w:ilvl w:val="0"/>
+          <w:numId w:val="5"/>
+        </w:numPr>
+      </w:pPr>
+      <w:proofErr w:type="spellStart"/>
+      <w:r>
+        <w:t>MontantTVA</w:t>
+      </w:r>
+      <w:proofErr w:type="spellEnd"/>
+      <w:r>
+        <w:t xml:space="preserve"> &lt;- </w:t>
+      </w:r>
+      <w:proofErr w:type="spellStart"/>
+      <w:proofErr w:type="gramStart"/>
+      <w:r>
+        <w:t>calculerTVA</w:t>
+      </w:r>
+      <w:proofErr w:type="spellEnd"/>
+      <w:r>
+        <w:t>(</w:t>
+      </w:r>
+      <w:proofErr w:type="spellStart"/>
+      <w:proofErr w:type="gramEnd"/>
+      <w:r>
+        <w:t>PrixHT</w:t>
+      </w:r>
+      <w:proofErr w:type="spellEnd"/>
+      <w:r>
+        <w:t xml:space="preserve">, </w:t>
+      </w:r>
+      <w:proofErr w:type="spellStart"/>
+      <w:r>
+        <w:t>TauxTVA</w:t>
+      </w:r>
+      <w:proofErr w:type="spellEnd"/>
+      <w:r>
+        <w:t>)</w:t>
+      </w:r>
+    </w:p>
+    <w:p>
+      <w:pPr>
+        <w:pStyle w:val="Paragraphedeliste"/>
+        <w:numPr>
+          <w:ilvl w:val="0"/>
+          <w:numId w:val="5"/>
+        </w:numPr>
+      </w:pPr>
+      <w:r>
+        <w:t xml:space="preserve">AFFICHER </w:t>
+      </w:r>
+      <w:proofErr w:type="spellStart"/>
+      <w:r>
+        <w:t>MontantTVA</w:t>
+      </w:r>
+      <w:proofErr w:type="spellEnd"/>
+    </w:p>
+    <w:p/>
+    <w:p>
+      <w:r>
         <w:t>Exercice 3</w:t>
       </w:r>
       <w:r>
@@ -202,26 +301,100 @@
     </w:p>
     <w:p>
       <w:pPr>
+        <w:ind w:firstLine="708"/>
+      </w:pPr>
+      <w:r>
+        <w:t>FIN</w:t>
+      </w:r>
+    </w:p>
+    <w:p>
+      <w:r>
+        <w:t>Utilisation</w:t>
+      </w:r>
+    </w:p>
+    <w:p>
+      <w:pPr>
         <w:pStyle w:val="Paragraphedeliste"/>
         <w:numPr>
           <w:ilvl w:val="0"/>
-          <w:numId w:val="2"/>
+          <w:numId w:val="7"/>
+        </w:numPr>
+      </w:pPr>
+      <w:r>
+        <w:t>Note1 &lt;- Note1 entrée</w:t>
+      </w:r>
+    </w:p>
+    <w:p>
+      <w:pPr>
+        <w:pStyle w:val="Paragraphedeliste"/>
+        <w:numPr>
+          <w:ilvl w:val="0"/>
+          <w:numId w:val="7"/>
+        </w:numPr>
+      </w:pPr>
+      <w:r>
+        <w:t>Note2 &lt;- Note2</w:t>
+      </w:r>
+      <w:r>
+        <w:t xml:space="preserve"> entré</w:t>
+      </w:r>
+      <w:r>
+        <w:t>e</w:t>
+      </w:r>
+    </w:p>
+    <w:p>
+      <w:pPr>
+        <w:pStyle w:val="Paragraphedeliste"/>
+        <w:numPr>
+          <w:ilvl w:val="0"/>
+          <w:numId w:val="7"/>
+        </w:numPr>
+      </w:pPr>
+      <w:r>
+        <w:t>Note3 &lt;- Note3</w:t>
+      </w:r>
+      <w:r>
+        <w:t xml:space="preserve"> entré</w:t>
+      </w:r>
+      <w:r>
+        <w:t>e</w:t>
+      </w:r>
+    </w:p>
+    <w:p>
+      <w:pPr>
+        <w:pStyle w:val="Paragraphedeliste"/>
+        <w:numPr>
+          <w:ilvl w:val="0"/>
+          <w:numId w:val="7"/>
+        </w:numPr>
+      </w:pPr>
+      <w:r>
+        <w:t xml:space="preserve">Moyenne &lt;- </w:t>
+      </w:r>
+      <w:proofErr w:type="spellStart"/>
+      <w:proofErr w:type="gramStart"/>
+      <w:r>
+        <w:t>calculerMoyenne</w:t>
+      </w:r>
+      <w:proofErr w:type="spellEnd"/>
+      <w:r>
+        <w:t>(</w:t>
+      </w:r>
+      <w:proofErr w:type="gramEnd"/>
+      <w:r>
+        <w:t>Note1, Note2, Note3)</w:t>
+      </w:r>
+    </w:p>
+    <w:p>
+      <w:pPr>
+        <w:pStyle w:val="Paragraphedeliste"/>
+        <w:numPr>
+          <w:ilvl w:val="0"/>
+          <w:numId w:val="7"/>
         </w:numPr>
       </w:pPr>
       <w:r>
         <w:t>AFFICHER Moyenne</w:t>
-      </w:r>
-    </w:p>
-    <w:p>
-      <w:pPr>
-        <w:pStyle w:val="Paragraphedeliste"/>
-        <w:numPr>
-          <w:ilvl w:val="0"/>
-          <w:numId w:val="2"/>
-        </w:numPr>
-      </w:pPr>
-      <w:r>
-        <w:t>FIN</w:t>
       </w:r>
     </w:p>
     <w:p>
@@ -318,13 +491,7 @@
         </w:numPr>
       </w:pPr>
       <w:r>
-        <w:t>AFFICHER « </w:t>
-      </w:r>
-      <w:r>
-        <w:t xml:space="preserve">Assez </w:t>
-      </w:r>
-      <w:r>
-        <w:t>Bien »</w:t>
+        <w:t>AFFICHER « Assez Bien »</w:t>
       </w:r>
     </w:p>
     <w:p>
@@ -348,13 +515,7 @@
         </w:numPr>
       </w:pPr>
       <w:r>
-        <w:t>AFFICHER « </w:t>
-      </w:r>
-      <w:r>
-        <w:t>Passable</w:t>
-      </w:r>
-      <w:r>
-        <w:t> »</w:t>
+        <w:t>AFFICHER « Passable »</w:t>
       </w:r>
     </w:p>
     <w:p>
@@ -378,13 +539,7 @@
         </w:numPr>
       </w:pPr>
       <w:r>
-        <w:t>AFFICHER « </w:t>
-      </w:r>
-      <w:r>
-        <w:t>Insuffisant</w:t>
-      </w:r>
-      <w:r>
-        <w:t> »</w:t>
+        <w:t>AFFICHER « Insuffisant »</w:t>
       </w:r>
     </w:p>
     <w:p>
@@ -438,6 +593,57 @@
     <w:p/>
     <w:p>
       <w:r>
+        <w:lastRenderedPageBreak/>
+        <w:t>Utilisation</w:t>
+      </w:r>
+    </w:p>
+    <w:p>
+      <w:pPr>
+        <w:pStyle w:val="Paragraphedeliste"/>
+        <w:numPr>
+          <w:ilvl w:val="0"/>
+          <w:numId w:val="8"/>
+        </w:numPr>
+      </w:pPr>
+      <w:r>
+        <w:t>Moyenne &lt;- Moyenne de l’utilisateur entrée</w:t>
+      </w:r>
+    </w:p>
+    <w:p>
+      <w:pPr>
+        <w:pStyle w:val="Paragraphedeliste"/>
+        <w:numPr>
+          <w:ilvl w:val="0"/>
+          <w:numId w:val="8"/>
+        </w:numPr>
+      </w:pPr>
+      <w:r>
+        <w:t xml:space="preserve">Mention &lt;- </w:t>
+      </w:r>
+      <w:proofErr w:type="spellStart"/>
+      <w:r>
+        <w:t>attribuerMoyenne</w:t>
+      </w:r>
+      <w:proofErr w:type="spellEnd"/>
+      <w:r>
+        <w:t>(moyenne)</w:t>
+      </w:r>
+    </w:p>
+    <w:p>
+      <w:pPr>
+        <w:pStyle w:val="Paragraphedeliste"/>
+        <w:numPr>
+          <w:ilvl w:val="0"/>
+          <w:numId w:val="8"/>
+        </w:numPr>
+      </w:pPr>
+      <w:r>
+        <w:t>AFFICHER Mention</w:t>
+      </w:r>
+    </w:p>
+    <w:p/>
+    <w:p>
+      <w:r>
         <w:t>Exercice 3.3 :</w:t>
       </w:r>
     </w:p>
@@ -450,13 +656,11 @@
         </w:numPr>
       </w:pPr>
       <w:r>
-        <w:t xml:space="preserve">Note1 &lt;- Note </w:t>
-      </w:r>
-      <w:proofErr w:type="gramStart"/>
-      <w:r>
-        <w:t>entré</w:t>
-      </w:r>
-      <w:proofErr w:type="gramEnd"/>
+        <w:t>Note1 &lt;- Note entré</w:t>
+      </w:r>
+      <w:r>
+        <w:t>e</w:t>
+      </w:r>
     </w:p>
     <w:p>
       <w:pPr>
@@ -467,19 +671,11 @@
         </w:numPr>
       </w:pPr>
       <w:r>
-        <w:t>N</w:t>
-      </w:r>
-      <w:r>
-        <w:t>ote2</w:t>
-      </w:r>
-      <w:r>
-        <w:t xml:space="preserve"> &lt;- Note </w:t>
-      </w:r>
-      <w:proofErr w:type="gramStart"/>
-      <w:r>
-        <w:t>entré</w:t>
-      </w:r>
-      <w:proofErr w:type="gramEnd"/>
+        <w:t>Note2 &lt;- Note entré</w:t>
+      </w:r>
+      <w:r>
+        <w:t>e</w:t>
+      </w:r>
     </w:p>
     <w:p>
       <w:pPr>
@@ -490,19 +686,13 @@
         </w:numPr>
       </w:pPr>
       <w:r>
-        <w:t>N</w:t>
-      </w:r>
-      <w:r>
-        <w:t>ote3</w:t>
-      </w:r>
-      <w:r>
-        <w:t xml:space="preserve"> &lt;- Note </w:t>
-      </w:r>
-      <w:proofErr w:type="gramStart"/>
-      <w:r>
-        <w:t>entré</w:t>
-      </w:r>
-      <w:proofErr w:type="gramEnd"/>
+        <w:t>Note3 &lt;- Note entré</w:t>
+      </w:r>
+      <w:r>
+        <w:t>e</w:t>
+      </w:r>
+      <w:bookmarkStart w:id="0" w:name="_GoBack"/>
+      <w:bookmarkEnd w:id="0"/>
     </w:p>
     <w:p>
       <w:pPr>
@@ -548,8 +738,6 @@
       <w:r>
         <w:t>(M</w:t>
       </w:r>
-      <w:bookmarkStart w:id="0" w:name="_GoBack"/>
-      <w:bookmarkEnd w:id="0"/>
       <w:r>
         <w:t>oyenne)</w:t>
       </w:r>
@@ -668,6 +856,184 @@
     </w:lvl>
   </w:abstractNum>
   <w:abstractNum w:abstractNumId="1" w15:restartNumberingAfterBreak="0">
+    <w:nsid w:val="05011CF3"/>
+    <w:multiLevelType w:val="hybridMultilevel"/>
+    <w:tmpl w:val="92F44348"/>
+    <w:lvl w:ilvl="0" w:tplc="040C000F">
+      <w:start w:val="1"/>
+      <w:numFmt w:val="decimal"/>
+      <w:lvlText w:val="%1."/>
+      <w:lvlJc w:val="left"/>
+      <w:pPr>
+        <w:ind w:left="720" w:hanging="360"/>
+      </w:pPr>
+      <w:rPr>
+        <w:rFonts w:hint="default"/>
+      </w:rPr>
+    </w:lvl>
+    <w:lvl w:ilvl="1" w:tplc="040C0019" w:tentative="1">
+      <w:start w:val="1"/>
+      <w:numFmt w:val="lowerLetter"/>
+      <w:lvlText w:val="%2."/>
+      <w:lvlJc w:val="left"/>
+      <w:pPr>
+        <w:ind w:left="1440" w:hanging="360"/>
+      </w:pPr>
+    </w:lvl>
+    <w:lvl w:ilvl="2" w:tplc="040C001B" w:tentative="1">
+      <w:start w:val="1"/>
+      <w:numFmt w:val="lowerRoman"/>
+      <w:lvlText w:val="%3."/>
+      <w:lvlJc w:val="right"/>
+      <w:pPr>
+        <w:ind w:left="2160" w:hanging="180"/>
+      </w:pPr>
+    </w:lvl>
+    <w:lvl w:ilvl="3" w:tplc="040C000F" w:tentative="1">
+      <w:start w:val="1"/>
+      <w:numFmt w:val="decimal"/>
+      <w:lvlText w:val="%4."/>
+      <w:lvlJc w:val="left"/>
+      <w:pPr>
+        <w:ind w:left="2880" w:hanging="360"/>
+      </w:pPr>
+    </w:lvl>
+    <w:lvl w:ilvl="4" w:tplc="040C0019" w:tentative="1">
+      <w:start w:val="1"/>
+      <w:numFmt w:val="lowerLetter"/>
+      <w:lvlText w:val="%5."/>
+      <w:lvlJc w:val="left"/>
+      <w:pPr>
+        <w:ind w:left="3600" w:hanging="360"/>
+      </w:pPr>
+    </w:lvl>
+    <w:lvl w:ilvl="5" w:tplc="040C001B" w:tentative="1">
+      <w:start w:val="1"/>
+      <w:numFmt w:val="lowerRoman"/>
+      <w:lvlText w:val="%6."/>
+      <w:lvlJc w:val="right"/>
+      <w:pPr>
+        <w:ind w:left="4320" w:hanging="180"/>
+      </w:pPr>
+    </w:lvl>
+    <w:lvl w:ilvl="6" w:tplc="040C000F" w:tentative="1">
+      <w:start w:val="1"/>
+      <w:numFmt w:val="decimal"/>
+      <w:lvlText w:val="%7."/>
+      <w:lvlJc w:val="left"/>
+      <w:pPr>
+        <w:ind w:left="5040" w:hanging="360"/>
+      </w:pPr>
+    </w:lvl>
+    <w:lvl w:ilvl="7" w:tplc="040C0019" w:tentative="1">
+      <w:start w:val="1"/>
+      <w:numFmt w:val="lowerLetter"/>
+      <w:lvlText w:val="%8."/>
+      <w:lvlJc w:val="left"/>
+      <w:pPr>
+        <w:ind w:left="5760" w:hanging="360"/>
+      </w:pPr>
+    </w:lvl>
+    <w:lvl w:ilvl="8" w:tplc="040C001B" w:tentative="1">
+      <w:start w:val="1"/>
+      <w:numFmt w:val="lowerRoman"/>
+      <w:lvlText w:val="%9."/>
+      <w:lvlJc w:val="right"/>
+      <w:pPr>
+        <w:ind w:left="6480" w:hanging="180"/>
+      </w:pPr>
+    </w:lvl>
+  </w:abstractNum>
+  <w:abstractNum w:abstractNumId="2" w15:restartNumberingAfterBreak="0">
+    <w:nsid w:val="12D93D29"/>
+    <w:multiLevelType w:val="hybridMultilevel"/>
+    <w:tmpl w:val="71A8D5BE"/>
+    <w:lvl w:ilvl="0" w:tplc="040C000F">
+      <w:start w:val="1"/>
+      <w:numFmt w:val="decimal"/>
+      <w:lvlText w:val="%1."/>
+      <w:lvlJc w:val="left"/>
+      <w:pPr>
+        <w:ind w:left="720" w:hanging="360"/>
+      </w:pPr>
+      <w:rPr>
+        <w:rFonts w:hint="default"/>
+      </w:rPr>
+    </w:lvl>
+    <w:lvl w:ilvl="1" w:tplc="040C0019" w:tentative="1">
+      <w:start w:val="1"/>
+      <w:numFmt w:val="lowerLetter"/>
+      <w:lvlText w:val="%2."/>
+      <w:lvlJc w:val="left"/>
+      <w:pPr>
+        <w:ind w:left="1440" w:hanging="360"/>
+      </w:pPr>
+    </w:lvl>
+    <w:lvl w:ilvl="2" w:tplc="040C001B" w:tentative="1">
+      <w:start w:val="1"/>
+      <w:numFmt w:val="lowerRoman"/>
+      <w:lvlText w:val="%3."/>
+      <w:lvlJc w:val="right"/>
+      <w:pPr>
+        <w:ind w:left="2160" w:hanging="180"/>
+      </w:pPr>
+    </w:lvl>
+    <w:lvl w:ilvl="3" w:tplc="040C000F" w:tentative="1">
+      <w:start w:val="1"/>
+      <w:numFmt w:val="decimal"/>
+      <w:lvlText w:val="%4."/>
+      <w:lvlJc w:val="left"/>
+      <w:pPr>
+        <w:ind w:left="2880" w:hanging="360"/>
+      </w:pPr>
+    </w:lvl>
+    <w:lvl w:ilvl="4" w:tplc="040C0019" w:tentative="1">
+      <w:start w:val="1"/>
+      <w:numFmt w:val="lowerLetter"/>
+      <w:lvlText w:val="%5."/>
+      <w:lvlJc w:val="left"/>
+      <w:pPr>
+        <w:ind w:left="3600" w:hanging="360"/>
+      </w:pPr>
+    </w:lvl>
+    <w:lvl w:ilvl="5" w:tplc="040C001B" w:tentative="1">
+      <w:start w:val="1"/>
+      <w:numFmt w:val="lowerRoman"/>
+      <w:lvlText w:val="%6."/>
+      <w:lvlJc w:val="right"/>
+      <w:pPr>
+        <w:ind w:left="4320" w:hanging="180"/>
+      </w:pPr>
+    </w:lvl>
+    <w:lvl w:ilvl="6" w:tplc="040C000F" w:tentative="1">
+      <w:start w:val="1"/>
+      <w:numFmt w:val="decimal"/>
+      <w:lvlText w:val="%7."/>
+      <w:lvlJc w:val="left"/>
+      <w:pPr>
+        <w:ind w:left="5040" w:hanging="360"/>
+      </w:pPr>
+    </w:lvl>
+    <w:lvl w:ilvl="7" w:tplc="040C0019" w:tentative="1">
+      <w:start w:val="1"/>
+      <w:numFmt w:val="lowerLetter"/>
+      <w:lvlText w:val="%8."/>
+      <w:lvlJc w:val="left"/>
+      <w:pPr>
+        <w:ind w:left="5760" w:hanging="360"/>
+      </w:pPr>
+    </w:lvl>
+    <w:lvl w:ilvl="8" w:tplc="040C001B" w:tentative="1">
+      <w:start w:val="1"/>
+      <w:numFmt w:val="lowerRoman"/>
+      <w:lvlText w:val="%9."/>
+      <w:lvlJc w:val="right"/>
+      <w:pPr>
+        <w:ind w:left="6480" w:hanging="180"/>
+      </w:pPr>
+    </w:lvl>
+  </w:abstractNum>
+  <w:abstractNum w:abstractNumId="3" w15:restartNumberingAfterBreak="0">
     <w:nsid w:val="17D45F4A"/>
     <w:multiLevelType w:val="hybridMultilevel"/>
     <w:tmpl w:val="394A18E8"/>
@@ -756,7 +1122,96 @@
       </w:pPr>
     </w:lvl>
   </w:abstractNum>
-  <w:abstractNum w:abstractNumId="2" w15:restartNumberingAfterBreak="0">
+  <w:abstractNum w:abstractNumId="4" w15:restartNumberingAfterBreak="0">
+    <w:nsid w:val="3D1A57D4"/>
+    <w:multiLevelType w:val="hybridMultilevel"/>
+    <w:tmpl w:val="6E146024"/>
+    <w:lvl w:ilvl="0" w:tplc="040C000F">
+      <w:start w:val="1"/>
+      <w:numFmt w:val="decimal"/>
+      <w:lvlText w:val="%1."/>
+      <w:lvlJc w:val="left"/>
+      <w:pPr>
+        <w:ind w:left="720" w:hanging="360"/>
+      </w:pPr>
+      <w:rPr>
+        <w:rFonts w:hint="default"/>
+      </w:rPr>
+    </w:lvl>
+    <w:lvl w:ilvl="1" w:tplc="040C0019" w:tentative="1">
+      <w:start w:val="1"/>
+      <w:numFmt w:val="lowerLetter"/>
+      <w:lvlText w:val="%2."/>
+      <w:lvlJc w:val="left"/>
+      <w:pPr>
+        <w:ind w:left="1440" w:hanging="360"/>
+      </w:pPr>
+    </w:lvl>
+    <w:lvl w:ilvl="2" w:tplc="040C001B" w:tentative="1">
+      <w:start w:val="1"/>
+      <w:numFmt w:val="lowerRoman"/>
+      <w:lvlText w:val="%3."/>
+      <w:lvlJc w:val="right"/>
+      <w:pPr>
+        <w:ind w:left="2160" w:hanging="180"/>
+      </w:pPr>
+    </w:lvl>
+    <w:lvl w:ilvl="3" w:tplc="040C000F" w:tentative="1">
+      <w:start w:val="1"/>
+      <w:numFmt w:val="decimal"/>
+      <w:lvlText w:val="%4."/>
+      <w:lvlJc w:val="left"/>
+      <w:pPr>
+        <w:ind w:left="2880" w:hanging="360"/>
+      </w:pPr>
+    </w:lvl>
+    <w:lvl w:ilvl="4" w:tplc="040C0019" w:tentative="1">
+      <w:start w:val="1"/>
+      <w:numFmt w:val="lowerLetter"/>
+      <w:lvlText w:val="%5."/>
+      <w:lvlJc w:val="left"/>
+      <w:pPr>
+        <w:ind w:left="3600" w:hanging="360"/>
+      </w:pPr>
+    </w:lvl>
+    <w:lvl w:ilvl="5" w:tplc="040C001B" w:tentative="1">
+      <w:start w:val="1"/>
+      <w:numFmt w:val="lowerRoman"/>
+      <w:lvlText w:val="%6."/>
+      <w:lvlJc w:val="right"/>
+      <w:pPr>
+        <w:ind w:left="4320" w:hanging="180"/>
+      </w:pPr>
+    </w:lvl>
+    <w:lvl w:ilvl="6" w:tplc="040C000F" w:tentative="1">
+      <w:start w:val="1"/>
+      <w:numFmt w:val="decimal"/>
+      <w:lvlText w:val="%7."/>
+      <w:lvlJc w:val="left"/>
+      <w:pPr>
+        <w:ind w:left="5040" w:hanging="360"/>
+      </w:pPr>
+    </w:lvl>
+    <w:lvl w:ilvl="7" w:tplc="040C0019" w:tentative="1">
+      <w:start w:val="1"/>
+      <w:numFmt w:val="lowerLetter"/>
+      <w:lvlText w:val="%8."/>
+      <w:lvlJc w:val="left"/>
+      <w:pPr>
+        <w:ind w:left="5760" w:hanging="360"/>
+      </w:pPr>
+    </w:lvl>
+    <w:lvl w:ilvl="8" w:tplc="040C001B" w:tentative="1">
+      <w:start w:val="1"/>
+      <w:numFmt w:val="lowerRoman"/>
+      <w:lvlText w:val="%9."/>
+      <w:lvlJc w:val="right"/>
+      <w:pPr>
+        <w:ind w:left="6480" w:hanging="180"/>
+      </w:pPr>
+    </w:lvl>
+  </w:abstractNum>
+  <w:abstractNum w:abstractNumId="5" w15:restartNumberingAfterBreak="0">
     <w:nsid w:val="4062233B"/>
     <w:multiLevelType w:val="hybridMultilevel"/>
     <w:tmpl w:val="AC62C250"/>
@@ -845,7 +1300,7 @@
       </w:pPr>
     </w:lvl>
   </w:abstractNum>
-  <w:abstractNum w:abstractNumId="3" w15:restartNumberingAfterBreak="0">
+  <w:abstractNum w:abstractNumId="6" w15:restartNumberingAfterBreak="0">
     <w:nsid w:val="629F3F62"/>
     <w:multiLevelType w:val="hybridMultilevel"/>
     <w:tmpl w:val="899E17CC"/>
@@ -871,6 +1326,95 @@
       </w:pPr>
     </w:lvl>
     <w:lvl w:ilvl="2" w:tplc="040C001B">
+      <w:start w:val="1"/>
+      <w:numFmt w:val="lowerRoman"/>
+      <w:lvlText w:val="%3."/>
+      <w:lvlJc w:val="right"/>
+      <w:pPr>
+        <w:ind w:left="2160" w:hanging="180"/>
+      </w:pPr>
+    </w:lvl>
+    <w:lvl w:ilvl="3" w:tplc="040C000F" w:tentative="1">
+      <w:start w:val="1"/>
+      <w:numFmt w:val="decimal"/>
+      <w:lvlText w:val="%4."/>
+      <w:lvlJc w:val="left"/>
+      <w:pPr>
+        <w:ind w:left="2880" w:hanging="360"/>
+      </w:pPr>
+    </w:lvl>
+    <w:lvl w:ilvl="4" w:tplc="040C0019" w:tentative="1">
+      <w:start w:val="1"/>
+      <w:numFmt w:val="lowerLetter"/>
+      <w:lvlText w:val="%5."/>
+      <w:lvlJc w:val="left"/>
+      <w:pPr>
+        <w:ind w:left="3600" w:hanging="360"/>
+      </w:pPr>
+    </w:lvl>
+    <w:lvl w:ilvl="5" w:tplc="040C001B" w:tentative="1">
+      <w:start w:val="1"/>
+      <w:numFmt w:val="lowerRoman"/>
+      <w:lvlText w:val="%6."/>
+      <w:lvlJc w:val="right"/>
+      <w:pPr>
+        <w:ind w:left="4320" w:hanging="180"/>
+      </w:pPr>
+    </w:lvl>
+    <w:lvl w:ilvl="6" w:tplc="040C000F" w:tentative="1">
+      <w:start w:val="1"/>
+      <w:numFmt w:val="decimal"/>
+      <w:lvlText w:val="%7."/>
+      <w:lvlJc w:val="left"/>
+      <w:pPr>
+        <w:ind w:left="5040" w:hanging="360"/>
+      </w:pPr>
+    </w:lvl>
+    <w:lvl w:ilvl="7" w:tplc="040C0019" w:tentative="1">
+      <w:start w:val="1"/>
+      <w:numFmt w:val="lowerLetter"/>
+      <w:lvlText w:val="%8."/>
+      <w:lvlJc w:val="left"/>
+      <w:pPr>
+        <w:ind w:left="5760" w:hanging="360"/>
+      </w:pPr>
+    </w:lvl>
+    <w:lvl w:ilvl="8" w:tplc="040C001B" w:tentative="1">
+      <w:start w:val="1"/>
+      <w:numFmt w:val="lowerRoman"/>
+      <w:lvlText w:val="%9."/>
+      <w:lvlJc w:val="right"/>
+      <w:pPr>
+        <w:ind w:left="6480" w:hanging="180"/>
+      </w:pPr>
+    </w:lvl>
+  </w:abstractNum>
+  <w:abstractNum w:abstractNumId="7" w15:restartNumberingAfterBreak="0">
+    <w:nsid w:val="76B547B2"/>
+    <w:multiLevelType w:val="hybridMultilevel"/>
+    <w:tmpl w:val="8364329A"/>
+    <w:lvl w:ilvl="0" w:tplc="040C000F">
+      <w:start w:val="1"/>
+      <w:numFmt w:val="decimal"/>
+      <w:lvlText w:val="%1."/>
+      <w:lvlJc w:val="left"/>
+      <w:pPr>
+        <w:ind w:left="720" w:hanging="360"/>
+      </w:pPr>
+      <w:rPr>
+        <w:rFonts w:hint="default"/>
+      </w:rPr>
+    </w:lvl>
+    <w:lvl w:ilvl="1" w:tplc="040C0019" w:tentative="1">
+      <w:start w:val="1"/>
+      <w:numFmt w:val="lowerLetter"/>
+      <w:lvlText w:val="%2."/>
+      <w:lvlJc w:val="left"/>
+      <w:pPr>
+        <w:ind w:left="1440" w:hanging="360"/>
+      </w:pPr>
+    </w:lvl>
+    <w:lvl w:ilvl="2" w:tplc="040C001B" w:tentative="1">
       <w:start w:val="1"/>
       <w:numFmt w:val="lowerRoman"/>
       <w:lvlText w:val="%3."/>
@@ -938,13 +1482,25 @@
     <w:abstractNumId w:val="0"/>
   </w:num>
   <w:num w:numId="2">
-    <w:abstractNumId w:val="1"/>
+    <w:abstractNumId w:val="3"/>
   </w:num>
   <w:num w:numId="3">
-    <w:abstractNumId w:val="3"/>
+    <w:abstractNumId w:val="6"/>
   </w:num>
   <w:num w:numId="4">
+    <w:abstractNumId w:val="5"/>
+  </w:num>
+  <w:num w:numId="5">
+    <w:abstractNumId w:val="4"/>
+  </w:num>
+  <w:num w:numId="6">
     <w:abstractNumId w:val="2"/>
+  </w:num>
+  <w:num w:numId="7">
+    <w:abstractNumId w:val="7"/>
+  </w:num>
+  <w:num w:numId="8">
+    <w:abstractNumId w:val="1"/>
   </w:num>
 </w:numbering>
 </file>

</xml_diff>

<commit_message>
DOCS : Modifs exercices
</commit_message>
<xml_diff>
--- a/Fonctions/Exercices Fonctions.docx
+++ b/Fonctions/Exercices Fonctions.docx
@@ -284,7 +284,10 @@
         </w:numPr>
       </w:pPr>
       <w:r>
-        <w:t>Moyenne &lt;- Somme / Nombre de notes</w:t>
+        <w:t>Mo</w:t>
+      </w:r>
+      <w:r>
+        <w:t>yenne &lt;- Somme / 3</w:t>
       </w:r>
     </w:p>
     <w:p>
@@ -442,8 +445,16 @@
           <w:numId w:val="3"/>
         </w:numPr>
       </w:pPr>
-      <w:r>
-        <w:t>AFFICHER « Très bien »</w:t>
+      <w:proofErr w:type="gramStart"/>
+      <w:r>
+        <w:t xml:space="preserve">RETOURNER </w:t>
+      </w:r>
+      <w:r>
+        <w:t xml:space="preserve"> «</w:t>
+      </w:r>
+      <w:proofErr w:type="gramEnd"/>
+      <w:r>
+        <w:t> Très bien »</w:t>
       </w:r>
     </w:p>
     <w:p>
@@ -467,7 +478,10 @@
         </w:numPr>
       </w:pPr>
       <w:r>
-        <w:t>AFFICHER « Bien »</w:t>
+        <w:t>RETOURNER</w:t>
+      </w:r>
+      <w:r>
+        <w:t xml:space="preserve"> « Bien »</w:t>
       </w:r>
     </w:p>
     <w:p>
@@ -491,7 +505,10 @@
         </w:numPr>
       </w:pPr>
       <w:r>
-        <w:t>AFFICHER « Assez Bien »</w:t>
+        <w:t>RETOURNER</w:t>
+      </w:r>
+      <w:r>
+        <w:t xml:space="preserve"> « Assez Bien »</w:t>
       </w:r>
     </w:p>
     <w:p>
@@ -515,7 +532,10 @@
         </w:numPr>
       </w:pPr>
       <w:r>
-        <w:t>AFFICHER « Passable »</w:t>
+        <w:t>RETOURNER</w:t>
+      </w:r>
+      <w:r>
+        <w:t xml:space="preserve"> « Passable »</w:t>
       </w:r>
     </w:p>
     <w:p>
@@ -539,7 +559,10 @@
         </w:numPr>
       </w:pPr>
       <w:r>
-        <w:t>AFFICHER « Insuffisant »</w:t>
+        <w:t>RETOURNER</w:t>
+      </w:r>
+      <w:r>
+        <w:t xml:space="preserve"> « Insuffisant »</w:t>
       </w:r>
     </w:p>
     <w:p>
@@ -592,23 +615,36 @@
       <w:r>
         <w:t>R</w:t>
       </w:r>
+      <w:r>
+        <w:t xml:space="preserve"> Mention</w:t>
+      </w:r>
+    </w:p>
+    <w:p>
+      <w:pPr>
+        <w:pStyle w:val="Paragraphedeliste"/>
+        <w:numPr>
+          <w:ilvl w:val="0"/>
+          <w:numId w:val="3"/>
+        </w:numPr>
+      </w:pPr>
+      <w:r>
+        <w:t>FIN</w:t>
+      </w:r>
+    </w:p>
+    <w:p>
+      <w:pPr>
+        <w:pStyle w:val="Paragraphedeliste"/>
+        <w:numPr>
+          <w:ilvl w:val="0"/>
+          <w:numId w:val="3"/>
+        </w:numPr>
+      </w:pPr>
+      <w:r>
+        <w:lastRenderedPageBreak/>
+        <w:t>AFFICHER Mention</w:t>
+      </w:r>
       <w:bookmarkStart w:id="0" w:name="_GoBack"/>
       <w:bookmarkEnd w:id="0"/>
-      <w:r>
-        <w:t xml:space="preserve"> Mention</w:t>
-      </w:r>
-    </w:p>
-    <w:p>
-      <w:pPr>
-        <w:pStyle w:val="Paragraphedeliste"/>
-        <w:numPr>
-          <w:ilvl w:val="0"/>
-          <w:numId w:val="3"/>
-        </w:numPr>
-      </w:pPr>
-      <w:r>
-        <w:t>FIN</w:t>
-      </w:r>
     </w:p>
     <w:p/>
     <w:p>

</xml_diff>